<commit_message>
26-07-22, Tweede bedrijf artikel bijgewerkt
</commit_message>
<xml_diff>
--- a/BlogsWord/HetTweedeBedrijf.docx
+++ b/BlogsWord/HetTweedeBedrijf.docx
@@ -219,15 +219,95 @@
           <w:sz w:val="22"/>
           <w:szCs w:val="22"/>
         </w:rPr>
-        <w:t xml:space="preserve"> heel treffend in de strafrechtbank van Manhattan (New York). Terwijl de rechters daar rondlopen in hun fraaie gewaden en de advocaten met hun dure schoenen, zitten er elke dag honderden mogelijke juryleden te wachten op hun mogelijke juryrol. Newyorkers worden voor een klein bedrag per uur betaald om een publieke rol te vervullen in openbare rechtspraak en het oude instituut van democratie. Mensen doen hier nog steeds graag aan mee en willen zo graag aan het algemeen belang bijdragen. Hier zit ook de kern in van de boodschap die MacLeod en Johnson met hun boek willen uitdragen dat democratie het delen van macht met elkaar is, waar </w:t>
-      </w:r>
-      <w:r>
-        <w:rPr>
-          <w:rFonts w:ascii="Courier New" w:hAnsi="Courier New" w:cs="Courier New"/>
-          <w:sz w:val="22"/>
-          <w:szCs w:val="22"/>
-        </w:rPr>
-        <w:t xml:space="preserve">publieken bijhoren, waar mensen met elkaar hun capaciteiten gebruiken om problemen op te lossen. </w:t>
+        <w:t xml:space="preserve"> heel treffend in de strafrechtbank van Manhattan (New York). Terwijl de rechters daar rondlopen in hun fraaie gewaden en de advocaten met hun dure schoenen, zitten er elke dag honderden mogelijke juryleden te wachten op hun juryrol. Newyorkers worden voor een klein bedrag per uur betaald om een publieke rol te vervullen in openbare rechtspraak en het oude instituut van democratie. Mensen doen hier nog steeds </w:t>
+      </w:r>
+      <w:r>
+        <w:rPr>
+          <w:rFonts w:ascii="Courier New" w:hAnsi="Courier New" w:cs="Courier New"/>
+          <w:sz w:val="22"/>
+          <w:szCs w:val="22"/>
+        </w:rPr>
+        <w:t xml:space="preserve">heel </w:t>
+      </w:r>
+      <w:r>
+        <w:rPr>
+          <w:rFonts w:ascii="Courier New" w:hAnsi="Courier New" w:cs="Courier New"/>
+          <w:sz w:val="22"/>
+          <w:szCs w:val="22"/>
+        </w:rPr>
+        <w:t xml:space="preserve">graag aan mee en willen aan het algemeen belang bijdragen. Hier zit </w:t>
+      </w:r>
+      <w:r>
+        <w:rPr>
+          <w:rFonts w:ascii="Courier New" w:hAnsi="Courier New" w:cs="Courier New"/>
+          <w:sz w:val="22"/>
+          <w:szCs w:val="22"/>
+        </w:rPr>
+        <w:t>meteen ook al</w:t>
+      </w:r>
+      <w:r>
+        <w:rPr>
+          <w:rFonts w:ascii="Courier New" w:hAnsi="Courier New" w:cs="Courier New"/>
+          <w:sz w:val="22"/>
+          <w:szCs w:val="22"/>
+        </w:rPr>
+        <w:t xml:space="preserve"> de kern in van de boodschap die MacLeod en Johnson met hun boek willen uitdragen</w:t>
+      </w:r>
+      <w:r>
+        <w:rPr>
+          <w:rFonts w:ascii="Courier New" w:hAnsi="Courier New" w:cs="Courier New"/>
+          <w:sz w:val="22"/>
+          <w:szCs w:val="22"/>
+        </w:rPr>
+        <w:t>,</w:t>
+      </w:r>
+      <w:r>
+        <w:rPr>
+          <w:rFonts w:ascii="Courier New" w:hAnsi="Courier New" w:cs="Courier New"/>
+          <w:sz w:val="22"/>
+          <w:szCs w:val="22"/>
+        </w:rPr>
+        <w:t xml:space="preserve"> dat democratie het delen van macht met elkaar is, waar </w:t>
+      </w:r>
+      <w:r>
+        <w:rPr>
+          <w:rFonts w:ascii="Courier New" w:hAnsi="Courier New" w:cs="Courier New"/>
+          <w:sz w:val="22"/>
+          <w:szCs w:val="22"/>
+        </w:rPr>
+        <w:t>publieken bijhoren</w:t>
+      </w:r>
+      <w:r>
+        <w:rPr>
+          <w:rFonts w:ascii="Courier New" w:hAnsi="Courier New" w:cs="Courier New"/>
+          <w:sz w:val="22"/>
+          <w:szCs w:val="22"/>
+        </w:rPr>
+        <w:t xml:space="preserve"> en</w:t>
+      </w:r>
+      <w:r>
+        <w:rPr>
+          <w:rFonts w:ascii="Courier New" w:hAnsi="Courier New" w:cs="Courier New"/>
+          <w:sz w:val="22"/>
+          <w:szCs w:val="22"/>
+        </w:rPr>
+        <w:t xml:space="preserve"> waar mensen met elkaar hun capaciteiten gebruiken om problemen op te lossen.</w:t>
+      </w:r>
+      <w:r>
+        <w:rPr>
+          <w:rFonts w:ascii="Courier New" w:hAnsi="Courier New" w:cs="Courier New"/>
+          <w:sz w:val="22"/>
+          <w:szCs w:val="22"/>
+        </w:rPr>
+        <w:t xml:space="preserve"> Dat is de volgende stap om als democratie te overleven.</w:t>
+      </w:r>
+      <w:r>
+        <w:rPr>
+          <w:rFonts w:ascii="Courier New" w:hAnsi="Courier New" w:cs="Courier New"/>
+          <w:sz w:val="22"/>
+          <w:szCs w:val="22"/>
+        </w:rPr>
+        <w:t xml:space="preserve"> </w:t>
       </w:r>
     </w:p>
     <w:p>
@@ -246,7 +326,23 @@
           <w:sz w:val="22"/>
           <w:szCs w:val="22"/>
         </w:rPr>
-        <w:t>Die democratie heeft haar eerste zeer succesvolle fase gehad die zich vooral voltrok rondom het stemrecht voor iedere burger. Dat simpele stemmen van vertegenwoordigers is heel belangrijk geweest voor de democratie van tegenwoordig</w:t>
+        <w:t>Die democratie heeft haar eerste zeer succesvolle fase gehad</w:t>
+      </w:r>
+      <w:r>
+        <w:rPr>
+          <w:rFonts w:ascii="Courier New" w:hAnsi="Courier New" w:cs="Courier New"/>
+          <w:sz w:val="22"/>
+          <w:szCs w:val="22"/>
+        </w:rPr>
+        <w:t>,</w:t>
+      </w:r>
+      <w:r>
+        <w:rPr>
+          <w:rFonts w:ascii="Courier New" w:hAnsi="Courier New" w:cs="Courier New"/>
+          <w:sz w:val="22"/>
+          <w:szCs w:val="22"/>
+        </w:rPr>
+        <w:t xml:space="preserve"> die zich vooral voltrok rondom het stemrecht voor iedere burger. Dat simpele stemmen van vertegenwoordigers is heel belangrijk geweest voor de democratie</w:t>
       </w:r>
       <w:r>
         <w:rPr>
@@ -302,23 +398,135 @@
           <w:sz w:val="22"/>
           <w:szCs w:val="22"/>
         </w:rPr>
-        <w:t xml:space="preserve">dat recht staat nog steeds onder druk. Tegelijk beseffen we ook dat democratie niet alleen verdedigd moet worden, maar ook een nieuwe fase nodig heeft om te overleven. Die nieuwe fase gaat over de rol die mensen met elkaar kunnen spelen op allerlei plekken in de gemeenschappen en buurten, op het werk, en op het lokale, provinciale en nationale niveau. </w:t>
-      </w:r>
-      <w:r>
-        <w:rPr>
-          <w:rFonts w:ascii="Courier New" w:hAnsi="Courier New" w:cs="Courier New"/>
-          <w:sz w:val="22"/>
-          <w:szCs w:val="22"/>
-        </w:rPr>
-        <w:t>Het gaat over de capaciteiten en rollen die publieken bezitten en vervullen en over de</w:t>
-      </w:r>
-      <w:r>
-        <w:rPr>
-          <w:rFonts w:ascii="Courier New" w:hAnsi="Courier New" w:cs="Courier New"/>
-          <w:sz w:val="22"/>
-          <w:szCs w:val="22"/>
-        </w:rPr>
-        <w:t xml:space="preserve"> voorwaarden waarop die publieken worden geïnformeerd, betrokken en productief gemaakt. De politiek heeft deze publieken nodig om te </w:t>
+        <w:t xml:space="preserve">dat recht staat nog steeds onder druk. Tegelijk beseffen we ook dat democratie niet alleen verdedigd moet worden, </w:t>
+      </w:r>
+      <w:r>
+        <w:rPr>
+          <w:rFonts w:ascii="Courier New" w:hAnsi="Courier New" w:cs="Courier New"/>
+          <w:sz w:val="22"/>
+          <w:szCs w:val="22"/>
+        </w:rPr>
+        <w:t xml:space="preserve">dat beseffen we </w:t>
+      </w:r>
+      <w:r>
+        <w:rPr>
+          <w:rFonts w:ascii="Courier New" w:hAnsi="Courier New" w:cs="Courier New"/>
+          <w:sz w:val="22"/>
+          <w:szCs w:val="22"/>
+        </w:rPr>
+        <w:t>maar</w:t>
+      </w:r>
+      <w:r>
+        <w:rPr>
+          <w:rFonts w:ascii="Courier New" w:hAnsi="Courier New" w:cs="Courier New"/>
+          <w:sz w:val="22"/>
+          <w:szCs w:val="22"/>
+        </w:rPr>
+        <w:t xml:space="preserve"> al te goed,</w:t>
+      </w:r>
+      <w:r>
+        <w:rPr>
+          <w:rFonts w:ascii="Courier New" w:hAnsi="Courier New" w:cs="Courier New"/>
+          <w:sz w:val="22"/>
+          <w:szCs w:val="22"/>
+        </w:rPr>
+        <w:t xml:space="preserve"> </w:t>
+      </w:r>
+      <w:r>
+        <w:rPr>
+          <w:rFonts w:ascii="Courier New" w:hAnsi="Courier New" w:cs="Courier New"/>
+          <w:sz w:val="22"/>
+          <w:szCs w:val="22"/>
+        </w:rPr>
+        <w:t xml:space="preserve">het heeft </w:t>
+      </w:r>
+      <w:r>
+        <w:rPr>
+          <w:rFonts w:ascii="Courier New" w:hAnsi="Courier New" w:cs="Courier New"/>
+          <w:sz w:val="22"/>
+          <w:szCs w:val="22"/>
+        </w:rPr>
+        <w:t xml:space="preserve">ook een nieuwe fase nodig heeft om </w:t>
+      </w:r>
+      <w:r>
+        <w:rPr>
+          <w:rFonts w:ascii="Courier New" w:hAnsi="Courier New" w:cs="Courier New"/>
+          <w:sz w:val="22"/>
+          <w:szCs w:val="22"/>
+        </w:rPr>
+        <w:t>verder te komen</w:t>
+      </w:r>
+      <w:r>
+        <w:rPr>
+          <w:rFonts w:ascii="Courier New" w:hAnsi="Courier New" w:cs="Courier New"/>
+          <w:sz w:val="22"/>
+          <w:szCs w:val="22"/>
+        </w:rPr>
+        <w:t xml:space="preserve">. </w:t>
+      </w:r>
+      <w:r>
+        <w:rPr>
+          <w:rFonts w:ascii="Courier New" w:hAnsi="Courier New" w:cs="Courier New"/>
+          <w:sz w:val="22"/>
+          <w:szCs w:val="22"/>
+        </w:rPr>
+        <w:t>In d</w:t>
+      </w:r>
+      <w:r>
+        <w:rPr>
+          <w:rFonts w:ascii="Courier New" w:hAnsi="Courier New" w:cs="Courier New"/>
+          <w:sz w:val="22"/>
+          <w:szCs w:val="22"/>
+        </w:rPr>
+        <w:t xml:space="preserve">ie nieuwe fase gaat </w:t>
+      </w:r>
+      <w:r>
+        <w:rPr>
+          <w:rFonts w:ascii="Courier New" w:hAnsi="Courier New" w:cs="Courier New"/>
+          <w:sz w:val="22"/>
+          <w:szCs w:val="22"/>
+        </w:rPr>
+        <w:t xml:space="preserve">het </w:t>
+      </w:r>
+      <w:r>
+        <w:rPr>
+          <w:rFonts w:ascii="Courier New" w:hAnsi="Courier New" w:cs="Courier New"/>
+          <w:sz w:val="22"/>
+          <w:szCs w:val="22"/>
+        </w:rPr>
+        <w:t xml:space="preserve">over de rol die mensen met elkaar kunnen spelen op allerlei plekken in de gemeenschappen en buurten, op het werk en op het lokale, provinciale en nationale niveau. </w:t>
+      </w:r>
+      <w:r>
+        <w:rPr>
+          <w:rFonts w:ascii="Courier New" w:hAnsi="Courier New" w:cs="Courier New"/>
+          <w:sz w:val="22"/>
+          <w:szCs w:val="22"/>
+        </w:rPr>
+        <w:t xml:space="preserve">Het gaat over de capaciteiten en rollen die publieken bezitten en </w:t>
+      </w:r>
+      <w:r>
+        <w:rPr>
+          <w:rFonts w:ascii="Courier New" w:hAnsi="Courier New" w:cs="Courier New"/>
+          <w:sz w:val="22"/>
+          <w:szCs w:val="22"/>
+        </w:rPr>
+        <w:t xml:space="preserve">kunnen </w:t>
+      </w:r>
+      <w:r>
+        <w:rPr>
+          <w:rFonts w:ascii="Courier New" w:hAnsi="Courier New" w:cs="Courier New"/>
+          <w:sz w:val="22"/>
+          <w:szCs w:val="22"/>
+        </w:rPr>
+        <w:t>vervullen en de</w:t>
+      </w:r>
+      <w:r>
+        <w:rPr>
+          <w:rFonts w:ascii="Courier New" w:hAnsi="Courier New" w:cs="Courier New"/>
+          <w:sz w:val="22"/>
+          <w:szCs w:val="22"/>
+        </w:rPr>
+        <w:t xml:space="preserve"> voorwaarden waarop die </w:t>
       </w:r>
       <w:r>
         <w:rPr>
@@ -327,15 +535,95 @@
           <w:szCs w:val="22"/>
         </w:rPr>
         <w:lastRenderedPageBreak/>
-        <w:t>overleven en aan te tonen dat mensen niet apatisch, dom of alleen maar op eigen belang gericht zijn</w:t>
-      </w:r>
-      <w:r>
-        <w:rPr>
-          <w:rFonts w:ascii="Courier New" w:hAnsi="Courier New" w:cs="Courier New"/>
-          <w:sz w:val="22"/>
-          <w:szCs w:val="22"/>
-        </w:rPr>
-        <w:t xml:space="preserve"> en ook solidair, verbeeldend en voor anderen kunnen zorgen. Die publieken zijn ook de manier waarop mensen hun wederkerigheid kunnen tonen. </w:t>
+        <w:t xml:space="preserve">publieken worden geïnformeerd, betrokken en productief gemaakt. </w:t>
+      </w:r>
+      <w:r>
+        <w:rPr>
+          <w:rFonts w:ascii="Courier New" w:hAnsi="Courier New" w:cs="Courier New"/>
+          <w:sz w:val="22"/>
+          <w:szCs w:val="22"/>
+        </w:rPr>
+        <w:t>P</w:t>
+      </w:r>
+      <w:r>
+        <w:rPr>
+          <w:rFonts w:ascii="Courier New" w:hAnsi="Courier New" w:cs="Courier New"/>
+          <w:sz w:val="22"/>
+          <w:szCs w:val="22"/>
+        </w:rPr>
+        <w:t>olitiek heeft deze publieken nodig om aan te tonen dat mensen niet apatisch, dom of alleen maar op eigen belang gericht zijn</w:t>
+      </w:r>
+      <w:r>
+        <w:rPr>
+          <w:rFonts w:ascii="Courier New" w:hAnsi="Courier New" w:cs="Courier New"/>
+          <w:sz w:val="22"/>
+          <w:szCs w:val="22"/>
+        </w:rPr>
+        <w:t xml:space="preserve"> en </w:t>
+      </w:r>
+      <w:r>
+        <w:rPr>
+          <w:rFonts w:ascii="Courier New" w:hAnsi="Courier New" w:cs="Courier New"/>
+          <w:sz w:val="22"/>
+          <w:szCs w:val="22"/>
+        </w:rPr>
+        <w:t>dat ze wel degelijk</w:t>
+      </w:r>
+      <w:r>
+        <w:rPr>
+          <w:rFonts w:ascii="Courier New" w:hAnsi="Courier New" w:cs="Courier New"/>
+          <w:sz w:val="22"/>
+          <w:szCs w:val="22"/>
+        </w:rPr>
+        <w:t xml:space="preserve"> solidair, verbeeldend en voor anderen kunnen zorgen. </w:t>
+      </w:r>
+      <w:r>
+        <w:rPr>
+          <w:rFonts w:ascii="Courier New" w:hAnsi="Courier New" w:cs="Courier New"/>
+          <w:sz w:val="22"/>
+          <w:szCs w:val="22"/>
+        </w:rPr>
+        <w:t>Met d</w:t>
+      </w:r>
+      <w:r>
+        <w:rPr>
+          <w:rFonts w:ascii="Courier New" w:hAnsi="Courier New" w:cs="Courier New"/>
+          <w:sz w:val="22"/>
+          <w:szCs w:val="22"/>
+        </w:rPr>
+        <w:t xml:space="preserve">ie publieken </w:t>
+      </w:r>
+      <w:r>
+        <w:rPr>
+          <w:rFonts w:ascii="Courier New" w:hAnsi="Courier New" w:cs="Courier New"/>
+          <w:sz w:val="22"/>
+          <w:szCs w:val="22"/>
+        </w:rPr>
+        <w:t>kunnen</w:t>
+      </w:r>
+      <w:r>
+        <w:rPr>
+          <w:rFonts w:ascii="Courier New" w:hAnsi="Courier New" w:cs="Courier New"/>
+          <w:sz w:val="22"/>
+          <w:szCs w:val="22"/>
+        </w:rPr>
+        <w:t xml:space="preserve"> mensen </w:t>
+      </w:r>
+      <w:r>
+        <w:rPr>
+          <w:rFonts w:ascii="Courier New" w:hAnsi="Courier New" w:cs="Courier New"/>
+          <w:sz w:val="22"/>
+          <w:szCs w:val="22"/>
+        </w:rPr>
+        <w:t xml:space="preserve">voorbij hun eigen belang komen en waarmee ze </w:t>
+      </w:r>
+      <w:r>
+        <w:rPr>
+          <w:rFonts w:ascii="Courier New" w:hAnsi="Courier New" w:cs="Courier New"/>
+          <w:sz w:val="22"/>
+          <w:szCs w:val="22"/>
+        </w:rPr>
+        <w:t xml:space="preserve">hun wederkerigheid kunnen tonen. </w:t>
       </w:r>
     </w:p>
     <w:p>
@@ -354,15 +642,143 @@
           <w:sz w:val="22"/>
           <w:szCs w:val="22"/>
         </w:rPr>
-        <w:t xml:space="preserve">Een revival van de democratie is ook nodig nu mensen zoveel vertrouwen zijn verloren in de politiek en hun vertegenwoordigers. Ook al is dat verlies van vertrouwen van mensen in de politiek alarmerend, wat misschien nog wel een groter probleem is dat de politiek zelf het vertrouwen in mensen is kwijtgeraakt. We verwachten misschien wel te weinig van mensen in plaats van teveel. Gezonden democratieën hebben gezonde publieken nodig, plaatsen waar mensen zich thuisvoelen, waar ze hun eigen belang terzijde kunnen schuiven en waar ze goed geïnformeerd en in gelijke posities met elkaar naar het algemene belang kunnen kijken. </w:t>
-      </w:r>
-      <w:r>
-        <w:rPr>
-          <w:rFonts w:ascii="Courier New" w:hAnsi="Courier New" w:cs="Courier New"/>
-          <w:sz w:val="22"/>
-          <w:szCs w:val="22"/>
-        </w:rPr>
-        <w:t xml:space="preserve">Mensen hebben platforms nodig om samen te werken en democratie is de praktijk van hiervan waar mensen redenen vinden om samen te werken, waar ze de mogelijkheden hebben om met elkaar ideeën te vormen en waar ze hiervoor kennis en capaciteiten ontwikkelen. </w:t>
+        <w:t>Een revival van de democratie is</w:t>
+      </w:r>
+      <w:r>
+        <w:rPr>
+          <w:rFonts w:ascii="Courier New" w:hAnsi="Courier New" w:cs="Courier New"/>
+          <w:sz w:val="22"/>
+          <w:szCs w:val="22"/>
+        </w:rPr>
+        <w:t xml:space="preserve"> </w:t>
+      </w:r>
+      <w:r>
+        <w:rPr>
+          <w:rFonts w:ascii="Courier New" w:hAnsi="Courier New" w:cs="Courier New"/>
+          <w:sz w:val="22"/>
+          <w:szCs w:val="22"/>
+        </w:rPr>
+        <w:t xml:space="preserve">nodig nu mensen zoveel vertrouwen zijn verloren in de politiek en hun vertegenwoordigers. Ook al is dat verlies van vertrouwen van mensen in de politiek alarmerend, een </w:t>
+      </w:r>
+      <w:r>
+        <w:rPr>
+          <w:rFonts w:ascii="Courier New" w:hAnsi="Courier New" w:cs="Courier New"/>
+          <w:sz w:val="22"/>
+          <w:szCs w:val="22"/>
+        </w:rPr>
+        <w:t xml:space="preserve">veel </w:t>
+      </w:r>
+      <w:r>
+        <w:rPr>
+          <w:rFonts w:ascii="Courier New" w:hAnsi="Courier New" w:cs="Courier New"/>
+          <w:sz w:val="22"/>
+          <w:szCs w:val="22"/>
+        </w:rPr>
+        <w:t xml:space="preserve">groter probleem is </w:t>
+      </w:r>
+      <w:r>
+        <w:rPr>
+          <w:rFonts w:ascii="Courier New" w:hAnsi="Courier New" w:cs="Courier New"/>
+          <w:sz w:val="22"/>
+          <w:szCs w:val="22"/>
+        </w:rPr>
+        <w:t xml:space="preserve">allicht </w:t>
+      </w:r>
+      <w:r>
+        <w:rPr>
+          <w:rFonts w:ascii="Courier New" w:hAnsi="Courier New" w:cs="Courier New"/>
+          <w:sz w:val="22"/>
+          <w:szCs w:val="22"/>
+        </w:rPr>
+        <w:t xml:space="preserve">dat de politiek zelf het vertrouwen in mensen is kwijtgeraakt. We verwachten misschien wel te weinig van mensen in plaats van teveel. Gezonde democratieën hebben gezonde publieken nodig, plaatsen waar mensen zich thuisvoelen, waar ze hun eigen belang terzijde kunnen schuiven en waar ze goed geïnformeerd en in gelijke posities met elkaar naar het algemene belang kunnen kijken. </w:t>
+      </w:r>
+      <w:r>
+        <w:rPr>
+          <w:rFonts w:ascii="Courier New" w:hAnsi="Courier New" w:cs="Courier New"/>
+          <w:sz w:val="22"/>
+          <w:szCs w:val="22"/>
+        </w:rPr>
+        <w:t>Mensen hebben platforms nodig om samen te werken en democratie is de praktijk hiervan</w:t>
+      </w:r>
+      <w:r>
+        <w:rPr>
+          <w:rFonts w:ascii="Courier New" w:hAnsi="Courier New" w:cs="Courier New"/>
+          <w:sz w:val="22"/>
+          <w:szCs w:val="22"/>
+        </w:rPr>
+        <w:t>. D</w:t>
+      </w:r>
+      <w:r>
+        <w:rPr>
+          <w:rFonts w:ascii="Courier New" w:hAnsi="Courier New" w:cs="Courier New"/>
+          <w:sz w:val="22"/>
+          <w:szCs w:val="22"/>
+        </w:rPr>
+        <w:t xml:space="preserve">aar </w:t>
+      </w:r>
+      <w:r>
+        <w:rPr>
+          <w:rFonts w:ascii="Courier New" w:hAnsi="Courier New" w:cs="Courier New"/>
+          <w:sz w:val="22"/>
+          <w:szCs w:val="22"/>
+        </w:rPr>
+        <w:t xml:space="preserve">vinden </w:t>
+      </w:r>
+      <w:r>
+        <w:rPr>
+          <w:rFonts w:ascii="Courier New" w:hAnsi="Courier New" w:cs="Courier New"/>
+          <w:sz w:val="22"/>
+          <w:szCs w:val="22"/>
+        </w:rPr>
+        <w:t>mensen redenen om samen te werken</w:t>
+      </w:r>
+      <w:r>
+        <w:rPr>
+          <w:rFonts w:ascii="Courier New" w:hAnsi="Courier New" w:cs="Courier New"/>
+          <w:sz w:val="22"/>
+          <w:szCs w:val="22"/>
+        </w:rPr>
+        <w:t xml:space="preserve"> en</w:t>
+      </w:r>
+      <w:r>
+        <w:rPr>
+          <w:rFonts w:ascii="Courier New" w:hAnsi="Courier New" w:cs="Courier New"/>
+          <w:sz w:val="22"/>
+          <w:szCs w:val="22"/>
+        </w:rPr>
+        <w:t xml:space="preserve"> mogelijkhede</w:t>
+      </w:r>
+      <w:r>
+        <w:rPr>
+          <w:rFonts w:ascii="Courier New" w:hAnsi="Courier New" w:cs="Courier New"/>
+          <w:sz w:val="22"/>
+          <w:szCs w:val="22"/>
+        </w:rPr>
+        <w:t>n</w:t>
+      </w:r>
+      <w:r>
+        <w:rPr>
+          <w:rFonts w:ascii="Courier New" w:hAnsi="Courier New" w:cs="Courier New"/>
+          <w:sz w:val="22"/>
+          <w:szCs w:val="22"/>
+        </w:rPr>
+        <w:t xml:space="preserve"> om met elkaar ideeën te vormen en </w:t>
+      </w:r>
+      <w:r>
+        <w:rPr>
+          <w:rFonts w:ascii="Courier New" w:hAnsi="Courier New" w:cs="Courier New"/>
+          <w:sz w:val="22"/>
+          <w:szCs w:val="22"/>
+        </w:rPr>
+        <w:t>daar ontwikkelen ze</w:t>
+      </w:r>
+      <w:r>
+        <w:rPr>
+          <w:rFonts w:ascii="Courier New" w:hAnsi="Courier New" w:cs="Courier New"/>
+          <w:sz w:val="22"/>
+          <w:szCs w:val="22"/>
+        </w:rPr>
+        <w:t xml:space="preserve"> kennis en capaciteiten. </w:t>
       </w:r>
     </w:p>
     <w:p>
@@ -425,15 +841,127 @@
           <w:sz w:val="22"/>
           <w:szCs w:val="22"/>
         </w:rPr>
-        <w:t xml:space="preserve">Democratie van het tweede bedrijf of deliberatieve democratie is niet iets onbekends en MacLeods en Johnson geven ons in hun boek een groot aantal voorbeelden. Ze beginnen met de storm van 13 december 1287 in Friesland die tienduizenden het leven kostte. Het was duidelijk dat bouwen op terpen niet voldoende was om waternoodrampen te voorkomen en dat we met elkaar op een andere manier tegen land en zee moesten aankijken. Er kwam een nieuw systeem van kanalen, dijken en landwinning. Er onstonden waterschappen, nieuwe publieken waarin mensen hun eigen belang aan de kant zetten en waarin het ging om het belang van hele gemeenschappen, gedeelde waarden, gemeenschappelijke interessen, dialoog, compromis en samen beslissingen nemen. Daarmee werd het verhaal van de Nederlandse waterschappen het verhaal van democratie in basisvorm. Ook in de recente geschiedenis komen MacLeod en Johnson met een voorbeeld. In Ierland was er ook </w:t>
-      </w:r>
-      <w:r>
-        <w:rPr>
-          <w:rFonts w:ascii="Courier New" w:hAnsi="Courier New" w:cs="Courier New"/>
-          <w:sz w:val="22"/>
-          <w:szCs w:val="22"/>
-        </w:rPr>
-        <w:t xml:space="preserve">vijftien jaar geleden ook een groot gebrek aan vertrouwen in de overheid en behoefte aan politieke hervorming. Die behoefte was er al heel lang. Op basis van Canadese voorbeeld werd er daar een soort </w:t>
+        <w:t xml:space="preserve">Democratie van het tweede bedrijf of deliberatieve democratie is niet iets onbekends en MacLeods en Johnson geven ons in hun boek een groot aantal voorbeelden. Ze beginnen met de storm van 13 december 1287 in Friesland die tienduizenden het leven kostte. Het was duidelijk dat bouwen op terpen niet voldoende was om waternoodrampen te voorkomen en dat </w:t>
+      </w:r>
+      <w:r>
+        <w:rPr>
+          <w:rFonts w:ascii="Courier New" w:hAnsi="Courier New" w:cs="Courier New"/>
+          <w:sz w:val="22"/>
+          <w:szCs w:val="22"/>
+        </w:rPr>
+        <w:t xml:space="preserve">mensen </w:t>
+      </w:r>
+      <w:r>
+        <w:rPr>
+          <w:rFonts w:ascii="Courier New" w:hAnsi="Courier New" w:cs="Courier New"/>
+          <w:sz w:val="22"/>
+          <w:szCs w:val="22"/>
+        </w:rPr>
+        <w:t xml:space="preserve">op een andere manier tegen land en zee moesten </w:t>
+      </w:r>
+      <w:r>
+        <w:rPr>
+          <w:rFonts w:ascii="Courier New" w:hAnsi="Courier New" w:cs="Courier New"/>
+          <w:sz w:val="22"/>
+          <w:szCs w:val="22"/>
+        </w:rPr>
+        <w:t xml:space="preserve">gaan </w:t>
+      </w:r>
+      <w:r>
+        <w:rPr>
+          <w:rFonts w:ascii="Courier New" w:hAnsi="Courier New" w:cs="Courier New"/>
+          <w:sz w:val="22"/>
+          <w:szCs w:val="22"/>
+        </w:rPr>
+        <w:t>aankijken. Er kwam een nieuw systeem van kanalen, dijken en landwinning</w:t>
+      </w:r>
+      <w:r>
+        <w:rPr>
+          <w:rFonts w:ascii="Courier New" w:hAnsi="Courier New" w:cs="Courier New"/>
+          <w:sz w:val="22"/>
+          <w:szCs w:val="22"/>
+        </w:rPr>
+        <w:t xml:space="preserve"> en er</w:t>
+      </w:r>
+      <w:r>
+        <w:rPr>
+          <w:rFonts w:ascii="Courier New" w:hAnsi="Courier New" w:cs="Courier New"/>
+          <w:sz w:val="22"/>
+          <w:szCs w:val="22"/>
+        </w:rPr>
+        <w:t xml:space="preserve"> onstonden waterschappen, nieuwe publieken waarin het ging om het belang van hele gemeenschappen, gedeelde waarden, gemeenschappelijke interessen, dialoog, compromis en samen beslissingen nemen. D</w:t>
+      </w:r>
+      <w:r>
+        <w:rPr>
+          <w:rFonts w:ascii="Courier New" w:hAnsi="Courier New" w:cs="Courier New"/>
+          <w:sz w:val="22"/>
+          <w:szCs w:val="22"/>
+        </w:rPr>
+        <w:t xml:space="preserve">it werd </w:t>
+      </w:r>
+      <w:r>
+        <w:rPr>
+          <w:rFonts w:ascii="Courier New" w:hAnsi="Courier New" w:cs="Courier New"/>
+          <w:sz w:val="22"/>
+          <w:szCs w:val="22"/>
+        </w:rPr>
+        <w:t>het verhaal van de Nederlandse waterschappen</w:t>
+      </w:r>
+      <w:r>
+        <w:rPr>
+          <w:rFonts w:ascii="Courier New" w:hAnsi="Courier New" w:cs="Courier New"/>
+          <w:sz w:val="22"/>
+          <w:szCs w:val="22"/>
+        </w:rPr>
+        <w:t>,</w:t>
+      </w:r>
+      <w:r>
+        <w:rPr>
+          <w:rFonts w:ascii="Courier New" w:hAnsi="Courier New" w:cs="Courier New"/>
+          <w:sz w:val="22"/>
+          <w:szCs w:val="22"/>
+        </w:rPr>
+        <w:t xml:space="preserve"> het verhaal van democratie in basisvorm. Ook in de recente geschiedenis komen MacLeod en Johnson met een voorbeeld. In Ierland was er </w:t>
+      </w:r>
+      <w:r>
+        <w:rPr>
+          <w:rFonts w:ascii="Courier New" w:hAnsi="Courier New" w:cs="Courier New"/>
+          <w:sz w:val="22"/>
+          <w:szCs w:val="22"/>
+        </w:rPr>
+        <w:t xml:space="preserve">vijftien jaar geleden een groot gebrek aan vertrouwen in de overheid en </w:t>
+      </w:r>
+      <w:r>
+        <w:rPr>
+          <w:rFonts w:ascii="Courier New" w:hAnsi="Courier New" w:cs="Courier New"/>
+          <w:sz w:val="22"/>
+          <w:szCs w:val="22"/>
+        </w:rPr>
+        <w:t xml:space="preserve">al heel lang </w:t>
+      </w:r>
+      <w:r>
+        <w:rPr>
+          <w:rFonts w:ascii="Courier New" w:hAnsi="Courier New" w:cs="Courier New"/>
+          <w:sz w:val="22"/>
+          <w:szCs w:val="22"/>
+        </w:rPr>
+        <w:t xml:space="preserve">behoefte aan politieke hervorming. Op basis van Canadese voorbeeld kwam </w:t>
+      </w:r>
+      <w:r>
+        <w:rPr>
+          <w:rFonts w:ascii="Courier New" w:hAnsi="Courier New" w:cs="Courier New"/>
+          <w:sz w:val="22"/>
+          <w:szCs w:val="22"/>
+        </w:rPr>
+        <w:t xml:space="preserve">er </w:t>
+      </w:r>
+      <w:r>
+        <w:rPr>
+          <w:rFonts w:ascii="Courier New" w:hAnsi="Courier New" w:cs="Courier New"/>
+          <w:sz w:val="22"/>
+          <w:szCs w:val="22"/>
+        </w:rPr>
+        <w:t xml:space="preserve">een Ierse </w:t>
       </w:r>
       <w:r>
         <w:rPr>
@@ -442,7 +970,87 @@
           <w:szCs w:val="22"/>
         </w:rPr>
         <w:lastRenderedPageBreak/>
-        <w:t>volksvergadering opgezet om over deze crisis door te praten. Er kwam een Ierse volksvertegenwoordiging van 99 burgervertegenwoordigers die met elkaar over de grondwet ging praten op basis waarvan er niet alleen een referendum over het homohuwelijk maar ook over abortus kwam. Het liet zien hoe een betrekkelijke kleine groep van burgers met elkaar een bron van democratie kunnen vormen en kunnen bijdragen aan de ontwikkelingen in een land. Dat idee van opbouwen van democratie is niet altijd eenvoudig en ook niet altijd succesvol, maar we zien deze initiatieven om met elkaar problemen op te lossen door</w:t>
+        <w:t>volksvertegenwoordiging van 99 burgervertegenwoordigers die met elkaar over de grondwet ging praten</w:t>
+      </w:r>
+      <w:r>
+        <w:rPr>
+          <w:rFonts w:ascii="Courier New" w:hAnsi="Courier New" w:cs="Courier New"/>
+          <w:sz w:val="22"/>
+          <w:szCs w:val="22"/>
+        </w:rPr>
+        <w:t>. Hun werk leidde</w:t>
+      </w:r>
+      <w:r>
+        <w:rPr>
+          <w:rFonts w:ascii="Courier New" w:hAnsi="Courier New" w:cs="Courier New"/>
+          <w:sz w:val="22"/>
+          <w:szCs w:val="22"/>
+        </w:rPr>
+        <w:t xml:space="preserve"> niet alleen </w:t>
+      </w:r>
+      <w:r>
+        <w:rPr>
+          <w:rFonts w:ascii="Courier New" w:hAnsi="Courier New" w:cs="Courier New"/>
+          <w:sz w:val="22"/>
+          <w:szCs w:val="22"/>
+        </w:rPr>
+        <w:t xml:space="preserve">tot </w:t>
+      </w:r>
+      <w:r>
+        <w:rPr>
+          <w:rFonts w:ascii="Courier New" w:hAnsi="Courier New" w:cs="Courier New"/>
+          <w:sz w:val="22"/>
+          <w:szCs w:val="22"/>
+        </w:rPr>
+        <w:t>een referendum over het homohuwelijk</w:t>
+      </w:r>
+      <w:r>
+        <w:rPr>
+          <w:rFonts w:ascii="Courier New" w:hAnsi="Courier New" w:cs="Courier New"/>
+          <w:sz w:val="22"/>
+          <w:szCs w:val="22"/>
+        </w:rPr>
+        <w:t>,</w:t>
+      </w:r>
+      <w:r>
+        <w:rPr>
+          <w:rFonts w:ascii="Courier New" w:hAnsi="Courier New" w:cs="Courier New"/>
+          <w:sz w:val="22"/>
+          <w:szCs w:val="22"/>
+        </w:rPr>
+        <w:t xml:space="preserve"> maar ook over abortus. </w:t>
+      </w:r>
+      <w:r>
+        <w:rPr>
+          <w:rFonts w:ascii="Courier New" w:hAnsi="Courier New" w:cs="Courier New"/>
+          <w:sz w:val="22"/>
+          <w:szCs w:val="22"/>
+        </w:rPr>
+        <w:t>Ierland had te maken met ‘een stille revolutie’. Dit</w:t>
+      </w:r>
+      <w:r>
+        <w:rPr>
+          <w:rFonts w:ascii="Courier New" w:hAnsi="Courier New" w:cs="Courier New"/>
+          <w:sz w:val="22"/>
+          <w:szCs w:val="22"/>
+        </w:rPr>
+        <w:t xml:space="preserve"> liet zien hoe een betrekkelijke kleine groep van burgers met elkaar een bron van democratie kunnen vormen en kunnen bijdragen aan de ontwikkelingen in een land. Dat idee van opbouwen van democratie is niet altijd eenvoudig en succesvol, maar </w:t>
+      </w:r>
+      <w:r>
+        <w:rPr>
+          <w:rFonts w:ascii="Courier New" w:hAnsi="Courier New" w:cs="Courier New"/>
+          <w:sz w:val="22"/>
+          <w:szCs w:val="22"/>
+        </w:rPr>
+        <w:t>dit soort</w:t>
+      </w:r>
+      <w:r>
+        <w:rPr>
+          <w:rFonts w:ascii="Courier New" w:hAnsi="Courier New" w:cs="Courier New"/>
+          <w:sz w:val="22"/>
+          <w:szCs w:val="22"/>
+        </w:rPr>
+        <w:t xml:space="preserve"> initiatieven om met elkaar problemen op te lossen door</w:t>
       </w:r>
       <w:r>
         <w:rPr>
@@ -458,6 +1066,14 @@
           <w:sz w:val="22"/>
           <w:szCs w:val="22"/>
         </w:rPr>
+        <w:t xml:space="preserve">zijn er </w:t>
+      </w:r>
+      <w:r>
+        <w:rPr>
+          <w:rFonts w:ascii="Courier New" w:hAnsi="Courier New" w:cs="Courier New"/>
+          <w:sz w:val="22"/>
+          <w:szCs w:val="22"/>
+        </w:rPr>
         <w:t>wereldwijd steeds vaker</w:t>
       </w:r>
       <w:r>
@@ -466,7 +1082,23 @@
           <w:sz w:val="22"/>
           <w:szCs w:val="22"/>
         </w:rPr>
-        <w:t>. In Frankrijk, Oostenrijk, Polen, Singapore, Wales, Schotland, Canada en België zijn er voorbeelden hiervan. Sinds 2019 zijn er meer dan negenhonderd vam deze volksvertegenwoordigingen geweest in ten minste veertig landen en dat aantal bereidt steeds verder uit. Het succes hangt van voorwaarden af, zoals hoe zijn de burgers geselecteerd, wie vertegenwoordigen ze, hoe worden ze geïnformeerd, wat leren ze en hoe worden ze gefaciliteerd, hoe gebruiken ze hun kennis, hoe nemen ze beslissingen en wat wordt er met die beslissingen gedaan. Ook al kunnen ze iets betekenen voor de politiek, ze worden door de politiek niet serieus genomen.</w:t>
+        <w:t>. In Frankrijk, Oostenrijk, Polen, Singapore, Wales, Schotland, Canada en België zijn er voorbeelden hiervan. Sinds 2019 zijn er meer dan negenhonderd vam deze volksvertegenwoordigingen geweest in ten minste veertig landen</w:t>
+      </w:r>
+      <w:r>
+        <w:rPr>
+          <w:rFonts w:ascii="Courier New" w:hAnsi="Courier New" w:cs="Courier New"/>
+          <w:sz w:val="22"/>
+          <w:szCs w:val="22"/>
+        </w:rPr>
+        <w:t xml:space="preserve">. Dat </w:t>
+      </w:r>
+      <w:r>
+        <w:rPr>
+          <w:rFonts w:ascii="Courier New" w:hAnsi="Courier New" w:cs="Courier New"/>
+          <w:sz w:val="22"/>
+          <w:szCs w:val="22"/>
+        </w:rPr>
+        <w:t>aantal bereidt steeds verder uit. Het succes hangt van voorwaarden af, zoals hoe zijn de burgers geselecteerd, wie vertegenwoordigen ze, hoe worden ze geïnformeerd, wat leren ze en hoe worden ze gefaciliteerd, hoe gebruiken ze hun kennis, hoe nemen ze beslissingen en wat wordt er met die beslissingen gedaan. Ook al kunnen ze iets betekenen voor de politiek, ze worden door de politiek niet serieus genomen.</w:t>
       </w:r>
     </w:p>
     <w:p>
@@ -485,6 +1117,147 @@
           <w:szCs w:val="22"/>
         </w:rPr>
         <w:tab/>
+        <w:t>Een steeds belangrijker onderdeel van publieke opinie in een vertegenwoordigende democratie is de peiling geworden</w:t>
+      </w:r>
+      <w:r>
+        <w:rPr>
+          <w:rFonts w:ascii="Courier New" w:hAnsi="Courier New" w:cs="Courier New"/>
+          <w:sz w:val="22"/>
+          <w:szCs w:val="22"/>
+        </w:rPr>
+        <w:t xml:space="preserve"> waarmee de mening van de burger op een eenvoudige manier gemeten wordt. De beperking daarvan wordt steeds meer ingezien. Het ondermijnt democratie steeds meer en het wordt een gereedschap om afwijkende meningen te onderdrukken en de verschillen tussen groepen uit te buiten. Het is beter om als overheden te zoeken naar hoe van mensen kan worden geleerd en het publiek te betrekken dan om eenvoudige peilingen te volgen. MacLeod en Johnson gaan op zoek naar initiatieven die hierbij passen, zoals het digitale platform vTaiwan en Polis die zorgt voor menselijke dialoog en gezamenlijke beslissing en </w:t>
+      </w:r>
+      <w:r>
+        <w:rPr>
+          <w:rFonts w:ascii="Courier New" w:hAnsi="Courier New" w:cs="Courier New"/>
+          <w:sz w:val="22"/>
+          <w:szCs w:val="22"/>
+        </w:rPr>
+        <w:t xml:space="preserve">een kracht voor creatieve politiek wordt. </w:t>
+      </w:r>
+    </w:p>
+    <w:p>
+      <w:pPr>
+        <w:spacing w:line="360" w:lineRule="auto"/>
+        <w:ind w:firstLine="720"/>
+        <w:rPr>
+          <w:rFonts w:ascii="Courier New" w:hAnsi="Courier New" w:cs="Courier New"/>
+          <w:sz w:val="22"/>
+          <w:szCs w:val="22"/>
+        </w:rPr>
+      </w:pPr>
+      <w:r>
+        <w:rPr>
+          <w:rFonts w:ascii="Courier New" w:hAnsi="Courier New" w:cs="Courier New"/>
+          <w:sz w:val="22"/>
+          <w:szCs w:val="22"/>
+        </w:rPr>
+        <w:t>Hoe van het publiek is te leren is</w:t>
+      </w:r>
+      <w:r>
+        <w:rPr>
+          <w:rFonts w:ascii="Courier New" w:hAnsi="Courier New" w:cs="Courier New"/>
+          <w:sz w:val="22"/>
+          <w:szCs w:val="22"/>
+        </w:rPr>
+        <w:t xml:space="preserve"> veel </w:t>
+      </w:r>
+      <w:r>
+        <w:rPr>
+          <w:rFonts w:ascii="Courier New" w:hAnsi="Courier New" w:cs="Courier New"/>
+          <w:sz w:val="22"/>
+          <w:szCs w:val="22"/>
+        </w:rPr>
+        <w:t>op te steken</w:t>
+      </w:r>
+      <w:r>
+        <w:rPr>
+          <w:rFonts w:ascii="Courier New" w:hAnsi="Courier New" w:cs="Courier New"/>
+          <w:sz w:val="22"/>
+          <w:szCs w:val="22"/>
+        </w:rPr>
+        <w:t xml:space="preserve"> van</w:t>
+      </w:r>
+      <w:r>
+        <w:rPr>
+          <w:rFonts w:ascii="Courier New" w:hAnsi="Courier New" w:cs="Courier New"/>
+          <w:sz w:val="22"/>
+          <w:szCs w:val="22"/>
+        </w:rPr>
+        <w:t xml:space="preserve"> wetenschappers als</w:t>
+      </w:r>
+      <w:r>
+        <w:rPr>
+          <w:rFonts w:ascii="Courier New" w:hAnsi="Courier New" w:cs="Courier New"/>
+          <w:sz w:val="22"/>
+          <w:szCs w:val="22"/>
+        </w:rPr>
+        <w:t xml:space="preserve"> Rosling (Zweden), Suzuki (Canada) en Nye (Amerika) en </w:t>
+      </w:r>
+      <w:r>
+        <w:rPr>
+          <w:rFonts w:ascii="Courier New" w:hAnsi="Courier New" w:cs="Courier New"/>
+          <w:sz w:val="22"/>
+          <w:szCs w:val="22"/>
+        </w:rPr>
+        <w:t xml:space="preserve">daarbij gaat het vooral om de </w:t>
+      </w:r>
+      <w:r>
+        <w:rPr>
+          <w:rFonts w:ascii="Courier New" w:hAnsi="Courier New" w:cs="Courier New"/>
+          <w:sz w:val="22"/>
+          <w:szCs w:val="22"/>
+        </w:rPr>
+        <w:t xml:space="preserve">liefde van kennis en het respect voor het publiek dat zij uitstralen. In de democratieën van tegenwoordig loopt de vrije pers ook gevaar omdat de nieuwsgaring in </w:t>
+      </w:r>
+      <w:r>
+        <w:rPr>
+          <w:rFonts w:ascii="Courier New" w:hAnsi="Courier New" w:cs="Courier New"/>
+          <w:sz w:val="22"/>
+          <w:szCs w:val="22"/>
+        </w:rPr>
+        <w:lastRenderedPageBreak/>
+        <w:t>handen is van een kleine groep hele rijke mensen en bedrijven die niet veel op hebben met het algemeen belang. En de manier waarop jongeren via sociale media worden benaderd. Daarvoor is het belangrijk om de monopolie van deze groepen te doorbreken, te investeren in publieke ruimtes (zeker met lokaal nieuws) en gebruikers te beschermen zoals dat voor andere infrastructuren heel normaal is. Een goed functionerende democratie is geen luxe.</w:t>
+      </w:r>
+      <w:r>
+        <w:rPr>
+          <w:rFonts w:ascii="Courier New" w:hAnsi="Courier New" w:cs="Courier New"/>
+          <w:sz w:val="22"/>
+          <w:szCs w:val="22"/>
+        </w:rPr>
+        <w:t xml:space="preserve"> Democratie heeft een betere communicatie nodig tussen overheid, experts en burgers, waarbij meer van burgers geleerd moet worden en zij ook meer vertrouwen krijgen. De burgers kunnen hier zelf initiatief toe nemen, zoals in het voorbeeld van grote hoeveelheden kindertanden verzamelen om met elkaar de invloed van oefeningen met nucleaire wapens aan te tonen; de burgerinitiatieven in Canada om met elkaaer Syrische vluchtelingen op te vangen; het ‘stolperstein’-project in Duitsland om zichtbaar te maken waar Joden woonden voordat de Nazis kwamen. Ook </w:t>
+      </w:r>
+      <w:r>
+        <w:rPr>
+          <w:rFonts w:ascii="Courier New" w:hAnsi="Courier New" w:cs="Courier New"/>
+          <w:sz w:val="22"/>
+          <w:szCs w:val="22"/>
+        </w:rPr>
+        <w:t>kunnen er associaties gevormd worden om met elkaar te leren, betrokken te zijn te zijn en algemeen belang en binding uit te drukken, zoals de jaarlijkse Folkemødet in Denemarken, het land van de associaties, als meerdaags democratiefestival voor duizenden mensen; de duizenden ‘People’s Association’ in Singaporte; en Community of Businesses-coöperatie in Ann Arbor; het kunnen ook kleinere gemeenschapsinitiatieven zijn zoals de Community Conferencing Center in Baltimore incidenten, criminaliteit en conflicten met elkaar op te lossen</w:t>
+      </w:r>
+      <w:r>
+        <w:rPr>
+          <w:rFonts w:ascii="Courier New" w:hAnsi="Courier New" w:cs="Courier New"/>
+          <w:sz w:val="22"/>
+          <w:szCs w:val="22"/>
+        </w:rPr>
+        <w:t>; of het Frontier College dat in Nova Scotia begon om immigranten te helpen bij hun integratie</w:t>
+      </w:r>
+      <w:r>
+        <w:rPr>
+          <w:rFonts w:ascii="Courier New" w:hAnsi="Courier New" w:cs="Courier New"/>
+          <w:sz w:val="22"/>
+          <w:szCs w:val="22"/>
+        </w:rPr>
+        <w:t>. De volksvertegenwoordigingen, de festivals, de associaties en de coöperaties zijn vormen om een volgende stap in democratie te zetten</w:t>
+      </w:r>
+      <w:r>
+        <w:rPr>
+          <w:rFonts w:ascii="Courier New" w:hAnsi="Courier New" w:cs="Courier New"/>
+          <w:sz w:val="22"/>
+          <w:szCs w:val="22"/>
+        </w:rPr>
+        <w:t xml:space="preserve">   </w:t>
       </w:r>
       <w:r>
         <w:rPr>
@@ -500,7 +1273,7 @@
           <w:sz w:val="22"/>
           <w:szCs w:val="22"/>
         </w:rPr>
-        <w:t xml:space="preserve">  </w:t>
+        <w:t xml:space="preserve"> </w:t>
       </w:r>
     </w:p>
     <w:p>
@@ -1336,6 +2109,7 @@
   <w:style w:type="character" w:default="1" w:styleId="DefaultParagraphFont">
     <w:name w:val="Default Paragraph Font"/>
     <w:uiPriority w:val="1"/>
+    <w:semiHidden/>
     <w:unhideWhenUsed/>
   </w:style>
   <w:style w:type="table" w:default="1" w:styleId="TableNormal">

</xml_diff>